<commit_message>
Repeat qPCR of the second-step PCR (SI 9, SI 10) with the corrected primer
The first qPCR used a wrongly designed primer. The qPCR was repeated with all five amplicon pools at the
same template amount (10^6 copies per reaction, 18 replicates per taxon), including a melt curve analysis
and a gel to check the amplicon size.

- SI 10: new raw data, per-well efficiencies, new sheet "Melt curves" and column "Melt peaks (n)"
- SI 9: new methods, results, Figure 9.1 (now with melt curves, panel C) and Table 9.1
- script: supporting_information_9_1 adds panel C (melt curves); results unchanged otherwise
- README and overview: mention of the melt curves

Co-Authored-By: Claude Sonnet 5.5 <noreply@anthropic.com>
</commit_message>
<xml_diff>
--- a/supporting information/supporting information 9.docx
+++ b/supporting information/supporting information 9.docx
@@ -181,133 +181,45 @@
           <w:sz w:val="24"/>
         </w:rPr>
       </w:pPr>
-      <w:r>
-        <w:rPr>
-          <w:sz w:val="24"/>
-        </w:rPr>
-        <w:t xml:space="preserve">The amplicon pools were used as </w:t>
-      </w:r>
-      <w:r>
-        <w:rPr>
-          <w:sz w:val="24"/>
-        </w:rPr>
-        <w:t>templates</w:t>
-      </w:r>
-      <w:r>
-        <w:rPr>
-          <w:sz w:val="24"/>
-        </w:rPr>
-        <w:t xml:space="preserve"> for a</w:t>
-      </w:r>
-      <w:r>
-        <w:rPr>
-          <w:sz w:val="24"/>
-        </w:rPr>
-        <w:t xml:space="preserve"> </w:t>
-      </w:r>
-      <w:r>
-        <w:rPr>
-          <w:sz w:val="24"/>
-        </w:rPr>
-        <w:t xml:space="preserve">qPCR. The pools were diluted in PCR-grade water so that all quantification cycles (Cq) fell within the linear range of the assay. qPCR was performed in 10 µL assays with 18 replicates per amplicon pool, using 1x </w:t>
-      </w:r>
       <w:proofErr w:type="spellStart"/>
-      <w:r>
-        <w:rPr>
-          <w:sz w:val="24"/>
-        </w:rPr>
-        <w:t>PerfeCTa</w:t>
-      </w:r>
       <w:proofErr w:type="spellEnd"/>
-      <w:r>
-        <w:rPr>
-          <w:sz w:val="24"/>
-        </w:rPr>
-        <w:t xml:space="preserve"> SYBR Green </w:t>
-      </w:r>
       <w:proofErr w:type="spellStart"/>
-      <w:r>
-        <w:rPr>
-          <w:sz w:val="24"/>
-        </w:rPr>
-        <w:t>FastMix</w:t>
-      </w:r>
       <w:proofErr w:type="spellEnd"/>
-      <w:r>
-        <w:rPr>
-          <w:sz w:val="24"/>
-        </w:rPr>
-        <w:t xml:space="preserve"> (</w:t>
-      </w:r>
       <w:proofErr w:type="spellStart"/>
-      <w:r>
-        <w:rPr>
-          <w:sz w:val="24"/>
-        </w:rPr>
-        <w:t>Quantabio</w:t>
-      </w:r>
       <w:proofErr w:type="spellEnd"/>
-      <w:r>
-        <w:rPr>
-          <w:sz w:val="24"/>
-        </w:rPr>
-        <w:t>, Beverly, MA, USA), 100 nM of universal binding site primers identical to those used for the second PCR (</w:t>
-      </w:r>
-      <w:r>
-        <w:rPr>
-          <w:sz w:val="24"/>
-        </w:rPr>
-        <w:t>forward universal tail: 5’-ACACTCTTTCCCTACACGACGCTCTTCCGATCT-3’, reverse universal tail: 5’-GTGACTGGAGTTCAGACGTGTGCTCTTCCGATCT-3’</w:t>
-      </w:r>
-      <w:r>
-        <w:rPr>
-          <w:sz w:val="24"/>
-        </w:rPr>
-        <w:t xml:space="preserve">) but excluding the Illumina index and the P5/P7 adapter, 3 µL of diluted template and filled up to 10 µL with PCR-grade water. Six no-template controls were included in the qPCR measurement. </w:t>
-      </w:r>
-      <w:r>
-        <w:rPr>
-          <w:sz w:val="24"/>
-        </w:rPr>
-        <w:t>qPCR was performed on a QuantStudio3 system (</w:t>
-      </w:r>
       <w:proofErr w:type="spellStart"/>
-      <w:r>
-        <w:rPr>
-          <w:sz w:val="24"/>
-        </w:rPr>
-        <w:t>Thermo</w:t>
-      </w:r>
       <w:proofErr w:type="spellEnd"/>
       <w:r>
         <w:rPr>
           <w:sz w:val="24"/>
         </w:rPr>
-        <w:t xml:space="preserve"> Fisher Scientific, Waltham, MA, USA</w:t>
-      </w:r>
-      <w:r>
-        <w:rPr>
-          <w:sz w:val="24"/>
-        </w:rPr>
-        <w:t>.</w:t>
-      </w:r>
-      <w:r>
-        <w:rPr>
-          <w:sz w:val="24"/>
-        </w:rPr>
-        <w:t xml:space="preserve"> Thermal</w:t>
-      </w:r>
-      <w:r>
-        <w:rPr>
-          <w:sz w:val="24"/>
-        </w:rPr>
-        <w:t xml:space="preserve"> cycling was performed with 3 min of initial denaturation followed by 40 cycles of 15 s denaturation at 95 °C and </w:t>
-      </w:r>
-      <w:r>
-        <w:rPr>
-          <w:sz w:val="24"/>
-        </w:rPr>
-        <w:t xml:space="preserve">60 s of combined annealing and extension at 61 °C, which corresponds to the annealing temperature of the second PCR step in the main experiment. A melt curve analysis was performed after amplification. </w:t>
+        <w:t>The amplicon pools were used as templates for a qPCR. The DNA concentration of each pool was measured with a Qubit fluorometer, and the pools were diluted in PCR-grade water to 10</w:t>
+      </w:r>
+      <w:r>
+        <w:rPr>
+          <w:sz w:val="24"/>
+          <w:vertAlign w:val="superscript"/>
+        </w:rPr>
+        <w:t>6</w:t>
+      </w:r>
+      <w:r>
+        <w:rPr>
+          <w:sz w:val="24"/>
+        </w:rPr>
+        <w:t xml:space="preserve"> copies per reaction (calculated from the concentration and the amplicon length of 331 bp), so that all taxa were measured at the same template amount. qPCR was performed in 10 µL assays with 18 replicates per amplicon pool, using 1x PerfeCTa SYBR Green FastMix (Quantabio, Beverly, MA, USA), 100 nM of universal binding site primers identical to those used for the second PCR (forward universal tail: 5’-ACACTCTTTCCCTACACGACGCTCTTCCGATCT-3’, reverse universal tail: 5’-GTGACTGGAGTTCAGACGTGTGCTCTTCCGATCT-3’) but excluding the Illumina index and the P5/P7 adapter, 1 µL of diluted template and filled up to 10 µL with PCR-grade water. Six no-template controls were included in the qPCR measurement. qPCR was performed on a QuantStudio3 system (Thermo Fisher Scientific, Waltham, MA, USA). Thermal cycling was performed with 3 min of initial denaturation followed by 40 cycles of 15 s denaturation at 95 °C and 60 s of combined annealing and extension at 61 °C, which corresponds to the annealing temperature of the second PCR step in the main experiment. A melt curve analysis was performed after amplification (15 s at 95 °C, 60 s at 60 °C, then a continuous increase to 95 °C at 0.15 °C s</w:t>
+      </w:r>
+      <w:r>
+        <w:rPr>
+          <w:sz w:val="24"/>
+          <w:vertAlign w:val="superscript"/>
+        </w:rPr>
+        <w:t>−1</w:t>
+      </w:r>
+      <w:r>
+        <w:rPr>
+          <w:sz w:val="24"/>
+        </w:rPr>
+        <w:t>) to check that each reaction contained a single product. After the qPCR, the products of all wells were separated on a 1 % agarose gel to check the amplicon size.</w:t>
       </w:r>
     </w:p>
     <w:p>
@@ -323,55 +235,7 @@
         <w:rPr>
           <w:sz w:val="24"/>
         </w:rPr>
-        <w:t>qPCR raw data were exported</w:t>
-      </w:r>
-      <w:r>
-        <w:rPr>
-          <w:sz w:val="24"/>
-        </w:rPr>
-        <w:t xml:space="preserve"> (Supporting information 10)</w:t>
-      </w:r>
-      <w:r>
-        <w:rPr>
-          <w:sz w:val="24"/>
-        </w:rPr>
-        <w:t xml:space="preserve"> and further analyzed with the RDML-Python library </w:t>
-      </w:r>
-      <w:r>
-        <w:rPr>
-          <w:sz w:val="24"/>
-        </w:rPr>
-        <w:fldChar w:fldCharType="begin"/>
-      </w:r>
-      <w:r>
-        <w:rPr>
-          <w:sz w:val="24"/>
-        </w:rPr>
-        <w:instrText xml:space="preserve"> ADDIN ZOTERO_ITEM CSL_CITATION {"citationID":"JdVpWnzG","properties":{"unsorted":false,"formattedCitation":"(Untergasser et al., 2021)","plainCitation":"(Untergasser et al., 2021)","noteIndex":0},"citationItems":[{"id":1143,"uris":["http://zotero.org/users/6327495/items/NUE3TYKZ"],"itemData":{"id":1143,"type":"article-journal","abstract":"Background\nThe analyses of amplification and melting curves have been shown to provide valuable information on the quality of the individual reactions in quantitative PCR (qPCR) experiments and to result in more reliable and reproducible quantitative results.\n\nImplementation\nThe main steps in the amplification curve analysis are (1) a unique baseline subtraction, not using the ground phase cycles, (2) PCR efficiency determination from the exponential phase of the individual reactions, (3) setting a common quantification threshold and (4) calculation of the efficiency-corrected target quantity with the common threshold, efficiency per assay and Cq per reaction. The melting curve analysis encompasses smoothing of the observed fluorescence data, normalization to remove product-independent fluorescence loss, peak calling and assessment of the correct peak by comparing its melting temperature with the known melting temperature of the intended amplification product.\n\nResults\nThe LinRegPCR web application provides visualization and analysis of a single qPCR run. The user interface displays the analysis results on the amplification curve analysis and melting curve analysis in tables and graphs in which deviant reactions are highlighted. The annotated results in the tables can be exported for calculation of gene-expression ratios, fold-change between experimental conditions and further statistical analysis. Web-based LinRegPCR addresses two types of users, wet-lab scientists analyzing the amplification and melting curves of their own qPCR experiments and bioinformaticians creating pipelines for analysis of series of qPCR experiments by splitting its functionality into a stand-alone back-end RDML (Real-time PCR Data Markup Language) Python library and several companion applications for data visualization, analysis and interactive access. The use of the RDML data standard enables machine independent storage and exchange of qPCR data and the RDML-Tools assist with the import of qPCR data from the files exported by the qPCR instrument.\n\nConclusions\nThe combined implementation of these analyses in the newly developed web-based LinRegPCR (https://www.gear-genomics.com/rdml-tools/) is platform independent and much faster than the original Windows-based versions of the LinRegPCR program. Moreover, web-based LinRegPCR includes a novel statistical outlier detection and the combination of amplification and melting curve analyses allows direct validation of the amplification product and reporting of reactions that amplify artefacts.\n\nSupplementary Information\nThe online version contains supplementary material available at 10.1186/s12859-021-04306-1.","container-title":"BMC Bioinformatics","DOI":"10.1186/s12859-021-04306-1","ISSN":"1471-2105","journalAbbreviation":"BMC Bioinformatics","page":"398","PMID":"34433408","PMCID":"PMC8386043","source":"PubMed Central","title":"Web-based LinRegPCR: application for the visualization and analysis of (RT)-qPCR amplification and melting data","title-short":"Web-based LinRegPCR","volume":"22","author":[{"family":"Untergasser","given":"Andreas"},{"family":"Ruijter","given":"Jan M."},{"family":"Benes","given":"Vladimir"},{"family":"Hoff","given":"Maurice J. B.","non-dropping-particle":"van den"}],"issued":{"date-parts":[["2021",8,24]]}}}],"schema":"https://github.com/citation-style-language/schema/raw/master/csl-citation.json"} </w:instrText>
-      </w:r>
-      <w:r>
-        <w:rPr>
-          <w:sz w:val="24"/>
-        </w:rPr>
-        <w:fldChar w:fldCharType="separate"/>
-      </w:r>
-      <w:r>
-        <w:rPr>
-          <w:sz w:val="24"/>
-        </w:rPr>
-        <w:t>(Untergasser et al., 2021)</w:t>
-      </w:r>
-      <w:r>
-        <w:rPr>
-          <w:sz w:val="24"/>
-        </w:rPr>
-        <w:fldChar w:fldCharType="end"/>
-      </w:r>
-      <w:r>
-        <w:rPr>
-          <w:sz w:val="24"/>
-        </w:rPr>
-        <w:t xml:space="preserve">. </w:t>
+        <w:t>qPCR raw data were exported (Supporting information 10) and further analyzed with the RDML-Python library (Untergasser et al., 2021). Peaks of the melt curves were identified in the smoothed derivative of the melt fluorescence (Savitzky-Golay filter, window of 7 points, polynomial order 2); peaks with a prominence of at least 5 % of the highest peak of the well were counted.</w:t>
       </w:r>
     </w:p>
     <w:p>
@@ -383,61 +247,13 @@
           <w:sz w:val="24"/>
         </w:rPr>
       </w:pPr>
-      <w:r>
-        <w:rPr>
-          <w:sz w:val="24"/>
-        </w:rPr>
-        <w:t xml:space="preserve">Per-well PCR efficiencies were estimated from the baseline-corrected fluorescence data with </w:t>
-      </w:r>
       <w:proofErr w:type="spellStart"/>
-      <w:r>
-        <w:rPr>
-          <w:sz w:val="24"/>
-        </w:rPr>
-        <w:t>LinRegPCR</w:t>
-      </w:r>
       <w:proofErr w:type="spellEnd"/>
       <w:r>
         <w:rPr>
           <w:sz w:val="24"/>
         </w:rPr>
-        <w:t xml:space="preserve"> </w:t>
-      </w:r>
-      <w:r>
-        <w:rPr>
-          <w:sz w:val="24"/>
-        </w:rPr>
-        <w:fldChar w:fldCharType="begin"/>
-      </w:r>
-      <w:r>
-        <w:rPr>
-          <w:sz w:val="24"/>
-        </w:rPr>
-        <w:instrText xml:space="preserve"> ADDIN ZOTERO_ITEM CSL_CITATION {"citationID":"g0y7arMV","properties":{"unsorted":false,"formattedCitation":"(Ruijter et al., 2009)","plainCitation":"(Ruijter et al., 2009)","noteIndex":0},"citationItems":[{"id":1148,"uris":["http://zotero.org/users/6327495/items/8SGUFBL3"],"itemData":{"id":1148,"type":"article-journal","abstract":"Despite the central role of quantitative PCR (qPCR) in the quantification of mRNA transcripts, most analyses of qPCR data are still delegated to the software that comes with the qPCR apparatus. This is especially true for the handling of the fluorescence baseline. This article shows that baseline estimation errors are directly reflected in the observed PCR efficiency values and are thus propagated exponentially in the estimated starting concentrations as well as ‘fold-difference’ results. Because of the unknown origin and kinetics of the baseline fluorescence, the fluorescence values monitored in the initial cycles of the PCR reaction cannot be used to estimate a useful baseline value. An algorithm that estimates the baseline by reconstructing the log-linear phase downward from the early plateau phase of the PCR reaction was developed and shown to lead to very reproducible PCR efficiency values. PCR efficiency values were determined per sample by fitting a regression line to a subset of data points in the log-linear phase. The variability, as well as the bias, in qPCR results was significantly reduced when the mean of these PCR efficiencies per amplicon was used in the calculation of an estimate of the starting concentration per sample.","container-title":"Nucleic Acids Research","DOI":"10.1093/nar/gkp045","ISSN":"0305-1048","issue":"6","journalAbbreviation":"Nucleic Acids Res","page":"e45","source":"Silverchair","title":"Amplification efficiency: linking baseline and bias in the analysis of quantitative PCR data","title-short":"Amplification efficiency","volume":"37","author":[{"family":"Ruijter","given":"J. M."},{"family":"Ramakers","given":"C."},{"family":"Hoogaars","given":"W. M. H."},{"family":"Karlen","given":"Y."},{"family":"Bakker","given":"O."},{"family":"Hoff","given":"M. J. B.","non-dropping-particle":"van den"},{"family":"Moorman","given":"A. F. M."}],"issued":{"date-parts":[["2009",4,1]]}}}],"schema":"https://github.com/citation-style-language/schema/raw/master/csl-citation.json"} </w:instrText>
-      </w:r>
-      <w:r>
-        <w:rPr>
-          <w:sz w:val="24"/>
-        </w:rPr>
-        <w:fldChar w:fldCharType="separate"/>
-      </w:r>
-      <w:r>
-        <w:rPr>
-          <w:sz w:val="24"/>
-        </w:rPr>
-        <w:t>(Ruijter et al., 2009)</w:t>
-      </w:r>
-      <w:r>
-        <w:rPr>
-          <w:sz w:val="24"/>
-        </w:rPr>
-        <w:fldChar w:fldCharType="end"/>
-      </w:r>
-      <w:r>
-        <w:rPr>
-          <w:sz w:val="24"/>
-        </w:rPr>
-        <w:t xml:space="preserve"> as implemented in RDML-Python (version 1.7.2), which determines the window of linearity for every well individually. Wells without a plateau, with an outlying efficiency or with an unstable baseline were excluded by the program; none of the 90 sample wells was excluded. E is given as the amplification factor per cycle (E = 2: perfect doubling). Because the residuals deviated from normality, efficiencies were compared between taxa with a Kruskal-Wallis test, and epsilon squared (H / (N − 1)) is given as effect size.</w:t>
+        <w:t>Per-well PCR efficiencies were estimated from the baseline-corrected fluorescence data with LinRegPCR (Ruijter et al., 2009) as implemented in RDML-Python (version 1.7.2), which determines the window of linearity for every well individually. Wells without a plateau, with an outlying efficiency or with an unstable baseline were excluded by the program; none of the 90 sample wells was excluded. E is given as the amplification factor per cycle (E = 2: perfect doubling). Efficiencies were compared between taxa with a Kruskal-Wallis test, which does not assume normally distributed residuals or equal variances, and epsilon squared (H / (N − 1)) is given as effect size.</w:t>
       </w:r>
     </w:p>
     <w:p>
@@ -453,19 +269,7 @@
         <w:rPr>
           <w:sz w:val="24"/>
         </w:rPr>
-        <w:t>The second-step PCR amplifie</w:t>
-      </w:r>
-      <w:r>
-        <w:rPr>
-          <w:sz w:val="24"/>
-        </w:rPr>
-        <w:t>s</w:t>
-      </w:r>
-      <w:r>
-        <w:rPr>
-          <w:sz w:val="24"/>
-        </w:rPr>
-        <w:t xml:space="preserve"> all five taxa with similar efficiencies (Figure 9.1, Table 9.1). Mean per-well efficiencies ranged from 1.923 (Amphipoda) to 1.942 (Diptera), a difference of 0.019, and single wells ranged from 1.847 to 2.016. Efficiencies differed significantly between taxa (Kruskal-Wallis, H(4) = 16.8, p = 0.002), with a moderate effect size (ε² = 0.19) but a small absolute difference. Over the 25 to 39 cycles of the second PCR step in the main experiment, the difference between the taxa with the highest and the lowest mean efficiency would amount to a 1.29- to 1.48-fold difference in product. Efficiencies above 2 (maximum 2.016, Amphipoda) are not physically possible and reflect the estimation noise of the per-well regression.</w:t>
+        <w:t>The second-step PCR amplifies all five taxa with similar efficiencies (Figure 9.1, Table 9.1). Mean per-well efficiencies ranged from 1.808 (Blattodea) to 1.824 (Amphipoda), a difference of 0.016, and single wells ranged from 1.772 to 1.872. Efficiencies did not differ significantly between taxa (Kruskal-Wallis, H(4) = 8.2, p = 0.086, ε² = 0.09). Over the 25 to 39 cycles of the second PCR step in the main experiment, the difference between the taxa with the highest and the lowest mean efficiency would amount to a 1.25- to 1.41-fold difference in product.</w:t>
       </w:r>
     </w:p>
     <w:p>
@@ -481,14 +285,7 @@
         <w:rPr>
           <w:sz w:val="24"/>
         </w:rPr>
-        <w:t xml:space="preserve">Cq values differed between the amplicon pools (median 21.5 for Blattodea to 28.0 for Amphipoda), because the pools contained different amounts of amplifiable template. These differences do not indicate differences in efficiency, which is derived from the </w:t>
-      </w:r>
-      <w:r>
-        <w:rPr>
-          <w:sz w:val="24"/>
-        </w:rPr>
-        <w:lastRenderedPageBreak/>
-        <w:t xml:space="preserve">slope of each amplification curve. Melting temperatures of the products ranged from 75.9 to 78.8 °C (Supporting information 10). No amplification was detected in the six no-template controls.</w:t>
+        <w:t>Because all amplicon pools were measured at the same template amount, the quantification cycles (Cq) were similar between taxa (median 14.3 for Amphipoda to 14.9 for Diptera; all wells 14.0 to 15.4). All 90 sample wells showed a single melt peak (Figure 9.1C). The melting temperatures of the products were specific for each taxon (median 75.2 °C for Lepidoptera, 75.8 °C for Hymenoptera, 76.2 °C for Amphipoda, 77.3 °C for Blattodea and 78.3 °C for Diptera; Supporting information 10), whereas primer dimers would be expected to melt at the same, lower temperature in all reactions. In the no-template controls, one of six wells (E11) crossed the threshold at Cq 38.2, 23.5 cycles later than the median of the samples, with a melt peak at 77.0 °C; in two further wells (C6, H1) the fluorescence increased only in the last cycles (Cq above 40), and no amplification was detected in the remaining three wells. On the agarose gel, all sample wells showed a product of the same size, and no discrete product was visible in any of the six no-template controls.</w:t>
       </w:r>
     </w:p>
     <w:p>
@@ -504,7 +301,7 @@
         </w:rPr>
         <w:drawing>
           <wp:inline distT="0" distB="0" distL="0" distR="0" wp14:anchorId="0EB116DF" wp14:editId="3C9D05CC">
-            <wp:extent cx="5753100" cy="2305050"/>
+            <wp:extent cx="5753100" cy="4071424"/>
             <wp:effectExtent l="19050" t="19050" r="19050" b="19050"/>
             <wp:docPr id="386968523" name="Grafik 1"/>
             <wp:cNvGraphicFramePr>
@@ -535,7 +332,7 @@
                   <pic:spPr bwMode="auto">
                     <a:xfrm>
                       <a:off x="0" y="0"/>
-                      <a:ext cx="5753100" cy="2305050"/>
+                      <a:ext cx="5753100" cy="4071424"/>
                     </a:xfrm>
                     <a:prstGeom prst="rect">
                       <a:avLst/>
@@ -568,6 +365,8 @@
           <w:lang w:val="en-US"/>
         </w:rPr>
       </w:pPr>
+      <w:proofErr w:type="spellStart"/>
+      <w:proofErr w:type="spellEnd"/>
       <w:r>
         <w:rPr>
           <w:rFonts w:ascii="Arial" w:hAnsi="Arial" w:cs="Arial"/>
@@ -580,7 +379,7 @@
           <w:szCs w:val="20"/>
           <w:lang w:val="en-US"/>
         </w:rPr>
-        <w:t xml:space="preserve">Figure 9.1:</w:t>
+        <w:t>Figure 9.1:</w:t>
       </w:r>
       <w:r>
         <w:rPr>
@@ -592,9 +391,21 @@
           <w:szCs w:val="20"/>
           <w:lang w:val="en-US"/>
         </w:rPr>
-        <w:t xml:space="preserve"> Efficiency of the second-step PCR across taxa. (A) Baseline-corrected amplification curves (thin lines: single wells; thick lines: median per taxon). (B) PCR efficiency E per well, estimated with </w:t>
-      </w:r>
-      <w:proofErr w:type="spellStart"/>
+        <w:t xml:space="preserve"> Efficiency of the second-step PCR across taxa. (A) Baseline-corrected amplification curves (thin lines: single wells; thick lines: median per taxon). (B) PCR efficiency E per well, estimated with LinRegPCR (box: median and interquartile range; whiskers: 1.5 × IQR; points: single wells). The dashed line marks E = 2 (perfect doubling per cycle). n = 18 wells per taxon. (C) Derivative of the melt curve of every well (coloured by taxon; dashed grey lines: no-template controls). All amplicon pools were measured at the same template amount (10</w:t>
+      </w:r>
+      <w:r>
+        <w:rPr>
+          <w:rFonts w:ascii="Arial" w:hAnsi="Arial" w:cs="Arial"/>
+          <w:i w:val="0"/>
+          <w:iCs w:val="0"/>
+          <w:color w:val="000000" w:themeColor="text1"/>
+          <w:sz w:val="20"/>
+          <w:szCs w:val="20"/>
+          <w:vertAlign w:val="superscript"/>
+          <w:lang w:val="en-US"/>
+        </w:rPr>
+        <w:t>6</w:t>
+      </w:r>
       <w:r>
         <w:rPr>
           <w:rFonts w:ascii="Arial" w:hAnsi="Arial" w:cs="Arial"/>
@@ -605,20 +416,7 @@
           <w:szCs w:val="20"/>
           <w:lang w:val="en-US"/>
         </w:rPr>
-        <w:t>LinRegPCR</w:t>
-      </w:r>
-      <w:proofErr w:type="spellEnd"/>
-      <w:r>
-        <w:rPr>
-          <w:rFonts w:ascii="Arial" w:hAnsi="Arial" w:cs="Arial"/>
-          <w:i w:val="0"/>
-          <w:iCs w:val="0"/>
-          <w:color w:val="000000" w:themeColor="text1"/>
-          <w:sz w:val="20"/>
-          <w:szCs w:val="20"/>
-          <w:lang w:val="en-US"/>
-        </w:rPr>
-        <w:t xml:space="preserve"> (box: median and interquartile range; whiskers: 1.5 × IQR; points: single wells). The dashed line marks E = 2 (perfect doubling per cycle). n = 18 wells per taxon. Differences in Cq between taxa reflect different template amounts of the amplicon pools. </w:t>
+        <w:t xml:space="preserve"> copies per reaction). </w:t>
       </w:r>
     </w:p>
     <w:p>
@@ -818,7 +616,7 @@
                 <w:szCs w:val="24"/>
                 <w:lang w:val="en-US"/>
               </w:rPr>
-              <w:t>1.923</w:t>
+              <w:t>1.824</w:t>
             </w:r>
           </w:p>
         </w:tc>
@@ -842,7 +640,7 @@
                 <w:szCs w:val="24"/>
                 <w:lang w:val="en-US"/>
               </w:rPr>
-              <w:t>1.847</w:t>
+              <w:t>1.785</w:t>
             </w:r>
           </w:p>
         </w:tc>
@@ -866,7 +664,7 @@
                 <w:szCs w:val="24"/>
                 <w:lang w:val="en-US"/>
               </w:rPr>
-              <w:t>2.016</w:t>
+              <w:t>1.872</w:t>
             </w:r>
           </w:p>
         </w:tc>
@@ -916,7 +714,7 @@
                 <w:szCs w:val="24"/>
                 <w:lang w:val="en-US"/>
               </w:rPr>
-              <w:t>1.926</w:t>
+              <w:t>1.808</w:t>
             </w:r>
           </w:p>
         </w:tc>
@@ -940,7 +738,7 @@
                 <w:szCs w:val="24"/>
                 <w:lang w:val="en-US"/>
               </w:rPr>
-              <w:t>1.894</w:t>
+              <w:t>1.785</w:t>
             </w:r>
           </w:p>
         </w:tc>
@@ -964,7 +762,7 @@
                 <w:szCs w:val="24"/>
                 <w:lang w:val="en-US"/>
               </w:rPr>
-              <w:t>1.968</w:t>
+              <w:t>1.834</w:t>
             </w:r>
           </w:p>
         </w:tc>
@@ -1014,7 +812,7 @@
                 <w:szCs w:val="24"/>
                 <w:lang w:val="en-US"/>
               </w:rPr>
-              <w:t>1.942</w:t>
+              <w:t>1.812</w:t>
             </w:r>
           </w:p>
         </w:tc>
@@ -1038,7 +836,7 @@
                 <w:szCs w:val="24"/>
                 <w:lang w:val="en-US"/>
               </w:rPr>
-              <w:t>1.917</w:t>
+              <w:t>1.793</w:t>
             </w:r>
           </w:p>
         </w:tc>
@@ -1062,7 +860,7 @@
                 <w:szCs w:val="24"/>
                 <w:lang w:val="en-US"/>
               </w:rPr>
-              <w:t>1.972</w:t>
+              <w:t>1.828</w:t>
             </w:r>
           </w:p>
         </w:tc>
@@ -1112,7 +910,7 @@
                 <w:szCs w:val="24"/>
                 <w:lang w:val="en-US"/>
               </w:rPr>
-              <w:t>1.933</w:t>
+              <w:t>1.815</w:t>
             </w:r>
           </w:p>
         </w:tc>
@@ -1136,7 +934,7 @@
                 <w:szCs w:val="24"/>
                 <w:lang w:val="en-US"/>
               </w:rPr>
-              <w:t>1.860</w:t>
+              <w:t>1.784</w:t>
             </w:r>
           </w:p>
         </w:tc>
@@ -1160,7 +958,7 @@
                 <w:szCs w:val="24"/>
                 <w:lang w:val="en-US"/>
               </w:rPr>
-              <w:t>1.959</w:t>
+              <w:t>1.842</w:t>
             </w:r>
           </w:p>
         </w:tc>
@@ -1210,7 +1008,7 @@
                 <w:szCs w:val="24"/>
                 <w:lang w:val="en-US"/>
               </w:rPr>
-              <w:t>1.928</w:t>
+              <w:t>1.811</w:t>
             </w:r>
           </w:p>
         </w:tc>
@@ -1234,7 +1032,7 @@
                 <w:szCs w:val="24"/>
                 <w:lang w:val="en-US"/>
               </w:rPr>
-              <w:t>1.899</w:t>
+              <w:t>1.772</w:t>
             </w:r>
           </w:p>
         </w:tc>
@@ -1258,7 +1056,7 @@
                 <w:szCs w:val="24"/>
                 <w:lang w:val="en-US"/>
               </w:rPr>
-              <w:t>1.974</w:t>
+              <w:t>1.858</w:t>
             </w:r>
           </w:p>
         </w:tc>

</xml_diff>